<commit_message>
docs(sim): regenerate the bilingual report with the corrected workspace figure
The document embeds the figure at build time, so it carried the old, misaligned
version. Rebuilt now that Word has released the file; the embedded image
matches docs/figures/05_workspace.png (138 KB). The temporary _new copy and
Word's lock file are gone.

Generated with [Devin](https://devin.ai)

Co-Authored-By: Devin <158243242+devin-ai-integration[bot]@users.noreply.github.com>
</commit_message>
<xml_diff>
--- a/firmware/Exoskeleton_F446/sim/mujoco_arm/docs/validation_report_bilingual.docx
+++ b/firmware/Exoskeleton_F446/sim/mujoco_arm/docs/validation_report_bilingual.docx
@@ -2482,7 +2482,7 @@
       <w:r>
         <w:drawing>
           <wp:inline xmlns:a="http://schemas.openxmlformats.org/drawingml/2006/main" xmlns:pic="http://schemas.openxmlformats.org/drawingml/2006/picture">
-            <wp:extent cx="5580000" cy="1562400"/>
+            <wp:extent cx="5580000" cy="1674000"/>
             <wp:docPr id="1" name="Picture 1"/>
             <wp:cNvGraphicFramePr>
               <a:graphicFrameLocks noChangeAspect="1"/>
@@ -2503,7 +2503,7 @@
                   <pic:spPr>
                     <a:xfrm>
                       <a:off x="0" y="0"/>
-                      <a:ext cx="5580000" cy="1562400"/>
+                      <a:ext cx="5580000" cy="1674000"/>
                     </a:xfrm>
                     <a:prstGeom prst="rect"/>
                   </pic:spPr>

</xml_diff>

<commit_message>
docs(sim): add implementation references, DOIs and the work list to the report
Sections 10-12 in both the Markdown report and the bilingual Word document:
a table of the sources actually read (ExoKit, MyoSim, the CAD package, MuJoCo,
the MyoSuite CMC tutorials, OpenSim CMC) with what was taken and adapted, the
reference list with DOIs, and a summary of what this project delivered per area
including an explicit "not done" row.

Generated with [Devin](https://devin.ai)

Co-Authored-By: Devin <158243242+devin-ai-integration[bot]@users.noreply.github.com>
</commit_message>
<xml_diff>
--- a/firmware/Exoskeleton_F446/sim/mujoco_arm/docs/validation_report_bilingual.docx
+++ b/firmware/Exoskeleton_F446/sim/mujoco_arm/docs/validation_report_bilingual.docx
@@ -4520,6 +4520,1394 @@
         <w:spacing w:after="40"/>
       </w:pPr>
     </w:p>
+    <w:p>
+      <w:pPr>
+        <w:spacing w:before="280" w:after="80"/>
+      </w:pPr>
+      <w:r>
+        <w:rPr>
+          <w:rFonts w:ascii="Calibri" w:hAnsi="Calibri" w:eastAsia="Microsoft YaHei"/>
+          <w:b/>
+          <w:i w:val="0"/>
+          <w:color w:val="1F3B57"/>
+          <w:sz w:val="30"/>
+        </w:rPr>
+        <w:t>10. 程序实现参考</w:t>
+      </w:r>
+      <w:r>
+        <w:rPr>
+          <w:rFonts w:ascii="Calibri" w:hAnsi="Calibri" w:eastAsia="Microsoft YaHei"/>
+          <w:b w:val="0"/>
+          <w:i/>
+          <w:color w:val="555555"/>
+          <w:sz w:val="30"/>
+        </w:rPr>
+        <w:t xml:space="preserve">  /  10. Implementation References</w:t>
+      </w:r>
+    </w:p>
+    <w:p>
+      <w:pPr>
+        <w:spacing w:after="40" w:line="276" w:lineRule="auto"/>
+      </w:pPr>
+      <w:r>
+        <w:rPr>
+          <w:rFonts w:ascii="Calibri" w:hAnsi="Calibri" w:eastAsia="Microsoft YaHei"/>
+          <w:b w:val="0"/>
+          <w:i w:val="0"/>
+          <w:sz w:val="21"/>
+        </w:rPr>
+        <w:t>本项目遵循“先复用现有实现，再参考开源项目，最后才自行编写”的顺序。下表列出实际读过的源码或文档，以及我们拿走了什么、改了什么。只列真正用到的，未使用的参考不列入。</w:t>
+      </w:r>
+    </w:p>
+    <w:p>
+      <w:pPr>
+        <w:spacing w:after="160" w:line="276" w:lineRule="auto"/>
+      </w:pPr>
+      <w:r>
+        <w:rPr>
+          <w:rFonts w:ascii="Calibri" w:hAnsi="Calibri" w:eastAsia="Microsoft YaHei"/>
+          <w:b w:val="0"/>
+          <w:i/>
+          <w:color w:val="555555"/>
+          <w:sz w:val="20"/>
+        </w:rPr>
+        <w:t>The project follows one order: reuse our own code first, then the referenced open-source projects, and only then write new code. The table lists the sources actually read, what was taken and what had to be adapted. Only what was used is listed.</w:t>
+      </w:r>
+    </w:p>
+    <w:tbl>
+      <w:tblPr>
+        <w:tblStyle w:val="TableGrid"/>
+        <w:tblW w:type="auto" w:w="0"/>
+        <w:jc w:val="center"/>
+        <w:tblLook w:firstColumn="1" w:firstRow="1" w:lastColumn="0" w:lastRow="0" w:noHBand="0" w:noVBand="1" w:val="04A0"/>
+      </w:tblPr>
+      <w:tblGrid>
+        <w:gridCol w:w="2436"/>
+        <w:gridCol w:w="2436"/>
+        <w:gridCol w:w="2436"/>
+        <w:gridCol w:w="2436"/>
+      </w:tblGrid>
+      <w:tr>
+        <w:tc>
+          <w:tcPr>
+            <w:tcW w:type="dxa" w:w="1814"/>
+          </w:tcPr>
+          <w:p>
+            <w:r/>
+            <w:r>
+              <w:rPr>
+                <w:rFonts w:ascii="Calibri" w:hAnsi="Calibri" w:eastAsia="Microsoft YaHei"/>
+                <w:b/>
+                <w:i w:val="0"/>
+                <w:sz w:val="16"/>
+              </w:rPr>
+              <w:t>模块 / Module</w:t>
+            </w:r>
+          </w:p>
+        </w:tc>
+        <w:tc>
+          <w:tcPr>
+            <w:tcW w:type="dxa" w:w="2494"/>
+          </w:tcPr>
+          <w:p>
+            <w:r/>
+            <w:r>
+              <w:rPr>
+                <w:rFonts w:ascii="Calibri" w:hAnsi="Calibri" w:eastAsia="Microsoft YaHei"/>
+                <w:b/>
+                <w:i w:val="0"/>
+                <w:sz w:val="16"/>
+              </w:rPr>
+              <w:t>参考来源 / Source</w:t>
+            </w:r>
+          </w:p>
+        </w:tc>
+        <w:tc>
+          <w:tcPr>
+            <w:tcW w:type="dxa" w:w="2494"/>
+          </w:tcPr>
+          <w:p>
+            <w:r/>
+            <w:r>
+              <w:rPr>
+                <w:rFonts w:ascii="Calibri" w:hAnsi="Calibri" w:eastAsia="Microsoft YaHei"/>
+                <w:b/>
+                <w:i w:val="0"/>
+                <w:sz w:val="16"/>
+              </w:rPr>
+              <w:t>拿走了什么 / Taken</w:t>
+            </w:r>
+          </w:p>
+        </w:tc>
+        <w:tc>
+          <w:tcPr>
+            <w:tcW w:type="dxa" w:w="2835"/>
+          </w:tcPr>
+          <w:p>
+            <w:r/>
+            <w:r>
+              <w:rPr>
+                <w:rFonts w:ascii="Calibri" w:hAnsi="Calibri" w:eastAsia="Microsoft YaHei"/>
+                <w:b/>
+                <w:i w:val="0"/>
+                <w:sz w:val="16"/>
+              </w:rPr>
+              <w:t>改了什么 / Adapted</w:t>
+            </w:r>
+          </w:p>
+        </w:tc>
+      </w:tr>
+      <w:tr>
+        <w:tc>
+          <w:tcPr>
+            <w:tcW w:type="dxa" w:w="1814"/>
+          </w:tcPr>
+          <w:p>
+            <w:r/>
+            <w:r>
+              <w:rPr>
+                <w:rFonts w:ascii="Calibri" w:hAnsi="Calibri" w:eastAsia="Microsoft YaHei"/>
+                <w:b w:val="0"/>
+                <w:i w:val="0"/>
+                <w:sz w:val="16"/>
+              </w:rPr>
+              <w:t>动作放大（Amplify）</w:t>
+            </w:r>
+          </w:p>
+        </w:tc>
+        <w:tc>
+          <w:tcPr>
+            <w:tcW w:type="dxa" w:w="2494"/>
+          </w:tcPr>
+          <w:p>
+            <w:r/>
+            <w:r>
+              <w:rPr>
+                <w:rFonts w:ascii="Calibri" w:hAnsi="Calibri" w:eastAsia="Microsoft YaHei"/>
+                <w:b w:val="0"/>
+                <w:i w:val="0"/>
+                <w:sz w:val="16"/>
+              </w:rPr>
+              <w:t>ExoKit `AmplifyReaction::runLoop()`</w:t>
+            </w:r>
+          </w:p>
+        </w:tc>
+        <w:tc>
+          <w:tcPr>
+            <w:tcW w:type="dxa" w:w="2494"/>
+          </w:tcPr>
+          <w:p>
+            <w:r/>
+            <w:r>
+              <w:rPr>
+                <w:rFonts w:ascii="Calibri" w:hAnsi="Calibri" w:eastAsia="Microsoft YaHei"/>
+                <w:b w:val="0"/>
+                <w:i w:val="0"/>
+                <w:sz w:val="16"/>
+              </w:rPr>
+              <w:t>速度触发、换向暂停（dirChangeSuspensionTime）的状态机</w:t>
+            </w:r>
+          </w:p>
+        </w:tc>
+        <w:tc>
+          <w:tcPr>
+            <w:tcW w:type="dxa" w:w="2835"/>
+          </w:tcPr>
+          <w:p>
+            <w:r/>
+            <w:r>
+              <w:rPr>
+                <w:rFonts w:ascii="Calibri" w:hAnsi="Calibri" w:eastAsia="Microsoft YaHei"/>
+                <w:b w:val="0"/>
+                <w:i w:val="0"/>
+                <w:sz w:val="16"/>
+              </w:rPr>
+              <w:t>改为肩、肘两通道；增量为转子 N·m / C620 A；改为瞬时切换；新增正功率门控（默认关）</w:t>
+            </w:r>
+          </w:p>
+        </w:tc>
+      </w:tr>
+      <w:tr>
+        <w:tc>
+          <w:tcPr>
+            <w:tcW w:type="dxa" w:w="1814"/>
+          </w:tcPr>
+          <w:p>
+            <w:r/>
+            <w:r>
+              <w:rPr>
+                <w:rFonts w:ascii="Calibri" w:hAnsi="Calibri" w:eastAsia="Microsoft YaHei"/>
+                <w:b w:val="0"/>
+                <w:i w:val="0"/>
+                <w:sz w:val="16"/>
+              </w:rPr>
+              <w:t>人体模型</w:t>
+            </w:r>
+          </w:p>
+        </w:tc>
+        <w:tc>
+          <w:tcPr>
+            <w:tcW w:type="dxa" w:w="2494"/>
+          </w:tcPr>
+          <w:p>
+            <w:r/>
+            <w:r>
+              <w:rPr>
+                <w:rFonts w:ascii="Calibri" w:hAnsi="Calibri" w:eastAsia="Microsoft YaHei"/>
+                <w:b w:val="0"/>
+                <w:i w:val="0"/>
+                <w:sz w:val="16"/>
+              </w:rPr>
+              <w:t>MyoSim 0.2.3 `myoarm_r`（Apache-2.0）</w:t>
+            </w:r>
+          </w:p>
+        </w:tc>
+        <w:tc>
+          <w:tcPr>
+            <w:tcW w:type="dxa" w:w="2494"/>
+          </w:tcPr>
+          <w:p>
+            <w:r/>
+            <w:r>
+              <w:rPr>
+                <w:rFonts w:ascii="Calibri" w:hAnsi="Calibri" w:eastAsia="Microsoft YaHei"/>
+                <w:b w:val="0"/>
+                <w:i w:val="0"/>
+                <w:sz w:val="16"/>
+              </w:rPr>
+              <w:t>骨骼几何、关节定义、63 块肌肉与力臂</w:t>
+            </w:r>
+          </w:p>
+        </w:tc>
+        <w:tc>
+          <w:tcPr>
+            <w:tcW w:type="dxa" w:w="2835"/>
+          </w:tcPr>
+          <w:p>
+            <w:r/>
+            <w:r>
+              <w:rPr>
+                <w:rFonts w:ascii="Calibri" w:hAnsi="Calibri" w:eastAsia="Microsoft YaHei"/>
+                <w:b w:val="0"/>
+                <w:i w:val="0"/>
+                <w:sz w:val="16"/>
+              </w:rPr>
+              <w:t>只保留肩前屈与屈肘两个自由度；抬臂平面烘焙进刚体姿态；去掉肌肉（度量模型保留）</w:t>
+            </w:r>
+          </w:p>
+        </w:tc>
+      </w:tr>
+      <w:tr>
+        <w:tc>
+          <w:tcPr>
+            <w:tcW w:type="dxa" w:w="1814"/>
+          </w:tcPr>
+          <w:p>
+            <w:r/>
+            <w:r>
+              <w:rPr>
+                <w:rFonts w:ascii="Calibri" w:hAnsi="Calibri" w:eastAsia="Microsoft YaHei"/>
+                <w:b w:val="0"/>
+                <w:i w:val="0"/>
+                <w:sz w:val="16"/>
+              </w:rPr>
+              <w:t>外骨骼几何与运动链</w:t>
+            </w:r>
+          </w:p>
+        </w:tc>
+        <w:tc>
+          <w:tcPr>
+            <w:tcW w:type="dxa" w:w="2494"/>
+          </w:tcPr>
+          <w:p>
+            <w:r/>
+            <w:r>
+              <w:rPr>
+                <w:rFonts w:ascii="Calibri" w:hAnsi="Calibri" w:eastAsia="Microsoft YaHei"/>
+                <w:b w:val="0"/>
+                <w:i w:val="0"/>
+                <w:sz w:val="16"/>
+              </w:rPr>
+              <w:t>本项目 CAD 导出包（OrthoEase）</w:t>
+            </w:r>
+          </w:p>
+        </w:tc>
+        <w:tc>
+          <w:tcPr>
+            <w:tcW w:type="dxa" w:w="2494"/>
+          </w:tcPr>
+          <w:p>
+            <w:r/>
+            <w:r>
+              <w:rPr>
+                <w:rFonts w:ascii="Calibri" w:hAnsi="Calibri" w:eastAsia="Microsoft YaHei"/>
+                <w:b w:val="0"/>
+                <w:i w:val="0"/>
+                <w:sz w:val="16"/>
+              </w:rPr>
+              <w:t>18 个 STL、两级转动关节、绑定点 site</w:t>
+            </w:r>
+          </w:p>
+        </w:tc>
+        <w:tc>
+          <w:tcPr>
+            <w:tcW w:type="dxa" w:w="2835"/>
+          </w:tcPr>
+          <w:p>
+            <w:r/>
+            <w:r>
+              <w:rPr>
+                <w:rFonts w:ascii="Calibri" w:hAnsi="Calibri" w:eastAsia="Microsoft YaHei"/>
+                <w:b w:val="0"/>
+                <w:i w:val="0"/>
+                <w:sz w:val="16"/>
+              </w:rPr>
+              <w:t>只读副本；质量按 STL 体积×ABS 重算；沿调节轨加长 34.8 mm 与人肘对齐；位置执行器换力矩执行器</w:t>
+            </w:r>
+          </w:p>
+        </w:tc>
+      </w:tr>
+      <w:tr>
+        <w:tc>
+          <w:tcPr>
+            <w:tcW w:type="dxa" w:w="1814"/>
+          </w:tcPr>
+          <w:p>
+            <w:r/>
+            <w:r>
+              <w:rPr>
+                <w:rFonts w:ascii="Calibri" w:hAnsi="Calibri" w:eastAsia="Microsoft YaHei"/>
+                <w:b w:val="0"/>
+                <w:i w:val="0"/>
+                <w:sz w:val="16"/>
+              </w:rPr>
+              <w:t>仿真引擎</w:t>
+            </w:r>
+          </w:p>
+        </w:tc>
+        <w:tc>
+          <w:tcPr>
+            <w:tcW w:type="dxa" w:w="2494"/>
+          </w:tcPr>
+          <w:p>
+            <w:r/>
+            <w:r>
+              <w:rPr>
+                <w:rFonts w:ascii="Calibri" w:hAnsi="Calibri" w:eastAsia="Microsoft YaHei"/>
+                <w:b w:val="0"/>
+                <w:i w:val="0"/>
+                <w:sz w:val="16"/>
+              </w:rPr>
+              <w:t>MuJoCo 3.16.0</w:t>
+            </w:r>
+          </w:p>
+        </w:tc>
+        <w:tc>
+          <w:tcPr>
+            <w:tcW w:type="dxa" w:w="2494"/>
+          </w:tcPr>
+          <w:p>
+            <w:r/>
+            <w:r>
+              <w:rPr>
+                <w:rFonts w:ascii="Calibri" w:hAnsi="Calibri" w:eastAsia="Microsoft YaHei"/>
+                <w:b w:val="0"/>
+                <w:i w:val="0"/>
+                <w:sz w:val="16"/>
+              </w:rPr>
+              <w:t>刚体动力学、等式约束、`mj_fullM`/`qfrc_bias`/`qfrc_passive`/`qfrc_constraint`</w:t>
+            </w:r>
+          </w:p>
+        </w:tc>
+        <w:tc>
+          <w:tcPr>
+            <w:tcW w:type="dxa" w:w="2835"/>
+          </w:tcPr>
+          <w:p>
+            <w:r/>
+            <w:r>
+              <w:rPr>
+                <w:rFonts w:ascii="Calibri" w:hAnsi="Calibri" w:eastAsia="Microsoft YaHei"/>
+                <w:b w:val="0"/>
+                <w:i w:val="0"/>
+                <w:sz w:val="16"/>
+              </w:rPr>
+              <w:t>无（只调用）</w:t>
+            </w:r>
+          </w:p>
+        </w:tc>
+      </w:tr>
+      <w:tr>
+        <w:tc>
+          <w:tcPr>
+            <w:tcW w:type="dxa" w:w="1814"/>
+          </w:tcPr>
+          <w:p>
+            <w:r/>
+            <w:r>
+              <w:rPr>
+                <w:rFonts w:ascii="Calibri" w:hAnsi="Calibri" w:eastAsia="Microsoft YaHei"/>
+                <w:b w:val="0"/>
+                <w:i w:val="0"/>
+                <w:sz w:val="16"/>
+              </w:rPr>
+              <w:t>肌肉控制方法</w:t>
+            </w:r>
+          </w:p>
+        </w:tc>
+        <w:tc>
+          <w:tcPr>
+            <w:tcW w:type="dxa" w:w="2494"/>
+          </w:tcPr>
+          <w:p>
+            <w:r/>
+            <w:r>
+              <w:rPr>
+                <w:rFonts w:ascii="Calibri" w:hAnsi="Calibri" w:eastAsia="Microsoft YaHei"/>
+                <w:b w:val="0"/>
+                <w:i w:val="0"/>
+                <w:sz w:val="16"/>
+              </w:rPr>
+              <w:t>MyoSuite 教程 `3.3_Inverse_Dynamics`、`3.4_Computed_Muscle_Control`；issue #337 维护者建议</w:t>
+            </w:r>
+          </w:p>
+        </w:tc>
+        <w:tc>
+          <w:tcPr>
+            <w:tcW w:type="dxa" w:w="2494"/>
+          </w:tcPr>
+          <w:p>
+            <w:r/>
+            <w:r>
+              <w:rPr>
+                <w:rFonts w:ascii="Calibri" w:hAnsi="Calibri" w:eastAsia="Microsoft YaHei"/>
+                <w:b w:val="0"/>
+                <w:i w:val="0"/>
+                <w:sz w:val="16"/>
+              </w:rPr>
+              <w:t>“期望加速度 → 所需广义力 → 静态优化分配肌肉”的流程</w:t>
+            </w:r>
+          </w:p>
+        </w:tc>
+        <w:tc>
+          <w:tcPr>
+            <w:tcW w:type="dxa" w:w="2835"/>
+          </w:tcPr>
+          <w:p>
+            <w:r/>
+            <w:r>
+              <w:rPr>
+                <w:rFonts w:ascii="Calibri" w:hAnsi="Calibri" w:eastAsia="Microsoft YaHei"/>
+                <w:b w:val="0"/>
+                <w:i w:val="0"/>
+                <w:sz w:val="16"/>
+              </w:rPr>
+              <w:t>`mj_inverse` 在本版本不填 `qfrc_inverse`（除非开离散标志），改用计算力矩公式自行计算</w:t>
+            </w:r>
+          </w:p>
+        </w:tc>
+      </w:tr>
+      <w:tr>
+        <w:tc>
+          <w:tcPr>
+            <w:tcW w:type="dxa" w:w="1814"/>
+          </w:tcPr>
+          <w:p>
+            <w:r/>
+            <w:r>
+              <w:rPr>
+                <w:rFonts w:ascii="Calibri" w:hAnsi="Calibri" w:eastAsia="Microsoft YaHei"/>
+                <w:b w:val="0"/>
+                <w:i w:val="0"/>
+                <w:sz w:val="16"/>
+              </w:rPr>
+              <w:t>桌面与场景写法</w:t>
+            </w:r>
+          </w:p>
+        </w:tc>
+        <w:tc>
+          <w:tcPr>
+            <w:tcW w:type="dxa" w:w="2494"/>
+          </w:tcPr>
+          <w:p>
+            <w:r/>
+            <w:r>
+              <w:rPr>
+                <w:rFonts w:ascii="Calibri" w:hAnsi="Calibri" w:eastAsia="Microsoft YaHei"/>
+                <w:b w:val="0"/>
+                <w:i w:val="0"/>
+                <w:sz w:val="16"/>
+              </w:rPr>
+              <w:t>MyoSuite/RoboHive `myoarm_relocate.xml`</w:t>
+            </w:r>
+          </w:p>
+        </w:tc>
+        <w:tc>
+          <w:tcPr>
+            <w:tcW w:type="dxa" w:w="2494"/>
+          </w:tcPr>
+          <w:p>
+            <w:r/>
+            <w:r>
+              <w:rPr>
+                <w:rFonts w:ascii="Calibri" w:hAnsi="Calibri" w:eastAsia="Microsoft YaHei"/>
+                <w:b w:val="0"/>
+                <w:i w:val="0"/>
+                <w:sz w:val="16"/>
+              </w:rPr>
+              <w:t>静态桌子 box + contype/conaffinity 写法</w:t>
+            </w:r>
+          </w:p>
+        </w:tc>
+        <w:tc>
+          <w:tcPr>
+            <w:tcW w:type="dxa" w:w="2835"/>
+          </w:tcPr>
+          <w:p>
+            <w:r/>
+            <w:r>
+              <w:rPr>
+                <w:rFonts w:ascii="Calibri" w:hAnsi="Calibri" w:eastAsia="Microsoft YaHei"/>
+                <w:b w:val="0"/>
+                <w:i w:val="0"/>
+                <w:sz w:val="16"/>
+              </w:rPr>
+              <w:t>桌子、方块、竖杆按本项目尺寸重建；竖杆轴线由 01B 夹持座 STL 截面算出</w:t>
+            </w:r>
+          </w:p>
+        </w:tc>
+      </w:tr>
+      <w:tr>
+        <w:tc>
+          <w:tcPr>
+            <w:tcW w:type="dxa" w:w="1814"/>
+          </w:tcPr>
+          <w:p>
+            <w:r/>
+            <w:r>
+              <w:rPr>
+                <w:rFonts w:ascii="Calibri" w:hAnsi="Calibri" w:eastAsia="Microsoft YaHei"/>
+                <w:b w:val="0"/>
+                <w:i w:val="0"/>
+                <w:sz w:val="16"/>
+              </w:rPr>
+              <w:t>控制律结构</w:t>
+            </w:r>
+          </w:p>
+        </w:tc>
+        <w:tc>
+          <w:tcPr>
+            <w:tcW w:type="dxa" w:w="2494"/>
+          </w:tcPr>
+          <w:p>
+            <w:r/>
+            <w:r>
+              <w:rPr>
+                <w:rFonts w:ascii="Calibri" w:hAnsi="Calibri" w:eastAsia="Microsoft YaHei"/>
+                <w:b w:val="0"/>
+                <w:i w:val="0"/>
+                <w:sz w:val="16"/>
+              </w:rPr>
+              <w:t>OpenSim CMC（Thelen 2003）</w:t>
+            </w:r>
+          </w:p>
+        </w:tc>
+        <w:tc>
+          <w:tcPr>
+            <w:tcW w:type="dxa" w:w="2494"/>
+          </w:tcPr>
+          <w:p>
+            <w:r/>
+            <w:r>
+              <w:rPr>
+                <w:rFonts w:ascii="Calibri" w:hAnsi="Calibri" w:eastAsia="Microsoft YaHei"/>
+                <w:b w:val="0"/>
+                <w:i w:val="0"/>
+                <w:sz w:val="16"/>
+              </w:rPr>
+              <w:t>“PD 求期望加速度 + 静态优化分配”的分层</w:t>
+            </w:r>
+          </w:p>
+        </w:tc>
+        <w:tc>
+          <w:tcPr>
+            <w:tcW w:type="dxa" w:w="2835"/>
+          </w:tcPr>
+          <w:p>
+            <w:r/>
+            <w:r>
+              <w:rPr>
+                <w:rFonts w:ascii="Calibri" w:hAnsi="Calibri" w:eastAsia="Microsoft YaHei"/>
+                <w:b w:val="0"/>
+                <w:i w:val="0"/>
+                <w:sz w:val="16"/>
+              </w:rPr>
+              <w:t>在 MuJoCo 中实现；无残差执行器</w:t>
+            </w:r>
+          </w:p>
+        </w:tc>
+      </w:tr>
+      <w:tr>
+        <w:tc>
+          <w:tcPr>
+            <w:tcW w:type="dxa" w:w="1814"/>
+          </w:tcPr>
+          <w:p>
+            <w:r/>
+            <w:r>
+              <w:rPr>
+                <w:rFonts w:ascii="Calibri" w:hAnsi="Calibri" w:eastAsia="Microsoft YaHei"/>
+                <w:b w:val="0"/>
+                <w:i w:val="0"/>
+                <w:sz w:val="16"/>
+              </w:rPr>
+              <w:t>固件底座与驱动</w:t>
+            </w:r>
+          </w:p>
+        </w:tc>
+        <w:tc>
+          <w:tcPr>
+            <w:tcW w:type="dxa" w:w="2494"/>
+          </w:tcPr>
+          <w:p>
+            <w:r/>
+            <w:r>
+              <w:rPr>
+                <w:rFonts w:ascii="Calibri" w:hAnsi="Calibri" w:eastAsia="Microsoft YaHei"/>
+                <w:b w:val="0"/>
+                <w:i w:val="0"/>
+                <w:sz w:val="16"/>
+              </w:rPr>
+              <w:t>STM32CubeF4、BetaRobot、UICRM-Embedded、Rhino-Pi-X1（见开源借鉴索引第 3/5/8/9 行）</w:t>
+            </w:r>
+          </w:p>
+        </w:tc>
+        <w:tc>
+          <w:tcPr>
+            <w:tcW w:type="dxa" w:w="2494"/>
+          </w:tcPr>
+          <w:p>
+            <w:r/>
+            <w:r>
+              <w:rPr>
+                <w:rFonts w:ascii="Calibri" w:hAnsi="Calibri" w:eastAsia="Microsoft YaHei"/>
+                <w:b w:val="0"/>
+                <w:i w:val="0"/>
+                <w:sz w:val="16"/>
+              </w:rPr>
+              <w:t>HAL 工程组织、CAN 收发与过滤器、GDS68/C620 报文解析骨架</w:t>
+            </w:r>
+          </w:p>
+        </w:tc>
+        <w:tc>
+          <w:tcPr>
+            <w:tcW w:type="dxa" w:w="2835"/>
+          </w:tcPr>
+          <w:p>
+            <w:r/>
+            <w:r>
+              <w:rPr>
+                <w:rFonts w:ascii="Calibri" w:hAnsi="Calibri" w:eastAsia="Microsoft YaHei"/>
+                <w:b w:val="0"/>
+                <w:i w:val="0"/>
+                <w:sz w:val="16"/>
+              </w:rPr>
+              <w:t>沿用既有固件，本次未改驱动层</w:t>
+            </w:r>
+          </w:p>
+        </w:tc>
+      </w:tr>
+      <w:tr>
+        <w:tc>
+          <w:tcPr>
+            <w:tcW w:type="dxa" w:w="1814"/>
+          </w:tcPr>
+          <w:p>
+            <w:r/>
+            <w:r>
+              <w:rPr>
+                <w:rFonts w:ascii="Calibri" w:hAnsi="Calibri" w:eastAsia="Microsoft YaHei"/>
+                <w:b w:val="0"/>
+                <w:i w:val="0"/>
+                <w:sz w:val="16"/>
+              </w:rPr>
+              <w:t>报告工具</w:t>
+            </w:r>
+          </w:p>
+        </w:tc>
+        <w:tc>
+          <w:tcPr>
+            <w:tcW w:type="dxa" w:w="2494"/>
+          </w:tcPr>
+          <w:p>
+            <w:r/>
+            <w:r>
+              <w:rPr>
+                <w:rFonts w:ascii="Calibri" w:hAnsi="Calibri" w:eastAsia="Microsoft YaHei"/>
+                <w:b w:val="0"/>
+                <w:i w:val="0"/>
+                <w:sz w:val="16"/>
+              </w:rPr>
+              <w:t>python-docx 1.2.0、matplotlib 3.10.9、numpy 2.4.6</w:t>
+            </w:r>
+          </w:p>
+        </w:tc>
+        <w:tc>
+          <w:tcPr>
+            <w:tcW w:type="dxa" w:w="2494"/>
+          </w:tcPr>
+          <w:p>
+            <w:r/>
+            <w:r>
+              <w:rPr>
+                <w:rFonts w:ascii="Calibri" w:hAnsi="Calibri" w:eastAsia="Microsoft YaHei"/>
+                <w:b w:val="0"/>
+                <w:i w:val="0"/>
+                <w:sz w:val="16"/>
+              </w:rPr>
+              <w:t>文档生成与绘图</w:t>
+            </w:r>
+          </w:p>
+        </w:tc>
+        <w:tc>
+          <w:tcPr>
+            <w:tcW w:type="dxa" w:w="2835"/>
+          </w:tcPr>
+          <w:p>
+            <w:r/>
+            <w:r>
+              <w:rPr>
+                <w:rFonts w:ascii="Calibri" w:hAnsi="Calibri" w:eastAsia="Microsoft YaHei"/>
+                <w:b w:val="0"/>
+                <w:i w:val="0"/>
+                <w:sz w:val="16"/>
+              </w:rPr>
+              <w:t>无</w:t>
+            </w:r>
+          </w:p>
+        </w:tc>
+      </w:tr>
+    </w:tbl>
+    <w:p>
+      <w:pPr>
+        <w:spacing w:after="40"/>
+      </w:pPr>
+    </w:p>
+    <w:p>
+      <w:pPr>
+        <w:spacing w:before="280" w:after="80"/>
+      </w:pPr>
+      <w:r>
+        <w:rPr>
+          <w:rFonts w:ascii="Calibri" w:hAnsi="Calibri" w:eastAsia="Microsoft YaHei"/>
+          <w:b/>
+          <w:i w:val="0"/>
+          <w:color w:val="1F3B57"/>
+          <w:sz w:val="30"/>
+        </w:rPr>
+        <w:t>11. 参考文献</w:t>
+      </w:r>
+      <w:r>
+        <w:rPr>
+          <w:rFonts w:ascii="Calibri" w:hAnsi="Calibri" w:eastAsia="Microsoft YaHei"/>
+          <w:b w:val="0"/>
+          <w:i/>
+          <w:color w:val="555555"/>
+          <w:sz w:val="30"/>
+        </w:rPr>
+        <w:t xml:space="preserve">  /  11. References</w:t>
+      </w:r>
+    </w:p>
+    <w:p>
+      <w:pPr>
+        <w:spacing w:after="60" w:line="276" w:lineRule="auto"/>
+        <w:ind w:left="454" w:hanging="454"/>
+      </w:pPr>
+      <w:r>
+        <w:rPr>
+          <w:rFonts w:ascii="Calibri" w:hAnsi="Calibri" w:eastAsia="Microsoft YaHei"/>
+          <w:b w:val="0"/>
+          <w:i w:val="0"/>
+          <w:sz w:val="18"/>
+        </w:rPr>
+        <w:t>[1] Choi H.S., Lee S.J., In H. Development and clinical validation of passive shoulder exoskeleton with novel gravity compensation mechanism for stabilizing arm tremor of surgeons during minimally invasive surgery. Front. Bioeng. Biotechnol. 12 (2024). DOI 10.3389/fbioe.2024.1418148</w:t>
+      </w:r>
+    </w:p>
+    <w:p>
+      <w:pPr>
+        <w:spacing w:after="60" w:line="276" w:lineRule="auto"/>
+        <w:ind w:left="454" w:hanging="454"/>
+      </w:pPr>
+      <w:r>
+        <w:rPr>
+          <w:rFonts w:ascii="Calibri" w:hAnsi="Calibri" w:eastAsia="Microsoft YaHei"/>
+          <w:b w:val="0"/>
+          <w:i w:val="0"/>
+          <w:sz w:val="18"/>
+        </w:rPr>
+        <w:t>[2] Barbieri D.F., Gonzales A., Srinivasan D., Raghuraman R.N., Carbonell A.M., Cha J.S. Evaluation of shoulder-support exoskeletons during simulated laparoscopic surgery across representative shoulder postures. Ergonomics (2026). DOI 10.1080/00140139.2026.2721391</w:t>
+      </w:r>
+    </w:p>
+    <w:p>
+      <w:pPr>
+        <w:spacing w:after="60" w:line="276" w:lineRule="auto"/>
+        <w:ind w:left="454" w:hanging="454"/>
+      </w:pPr>
+      <w:r>
+        <w:rPr>
+          <w:rFonts w:ascii="Calibri" w:hAnsi="Calibri" w:eastAsia="Microsoft YaHei"/>
+          <w:b w:val="0"/>
+          <w:i w:val="0"/>
+          <w:sz w:val="18"/>
+        </w:rPr>
+        <w:t>[3] Ramella G., Grazi L., et al. Evaluation of antigravitational support levels provided by a passive upper-limb occupational exoskeleton in repetitive arm movements. Applied Ergonomics (2024). DOI 10.1016/j.apergo.2024.104226</w:t>
+      </w:r>
+    </w:p>
+    <w:p>
+      <w:pPr>
+        <w:spacing w:after="60" w:line="276" w:lineRule="auto"/>
+        <w:ind w:left="454" w:hanging="454"/>
+      </w:pPr>
+      <w:r>
+        <w:rPr>
+          <w:rFonts w:ascii="Calibri" w:hAnsi="Calibri" w:eastAsia="Microsoft YaHei"/>
+          <w:b w:val="0"/>
+          <w:i w:val="0"/>
+          <w:sz w:val="18"/>
+        </w:rPr>
+        <w:t>[4] J Safety Research (2024). Evaluation of a passive arm-support exoskeleton for surgical team members: results from live surgeries. DOI 10.1016/j.jsr.2024.02.003</w:t>
+      </w:r>
+    </w:p>
+    <w:p>
+      <w:pPr>
+        <w:spacing w:after="60" w:line="276" w:lineRule="auto"/>
+        <w:ind w:left="454" w:hanging="454"/>
+      </w:pPr>
+      <w:r>
+        <w:rPr>
+          <w:rFonts w:ascii="Calibri" w:hAnsi="Calibri" w:eastAsia="Microsoft YaHei"/>
+          <w:b w:val="0"/>
+          <w:i w:val="0"/>
+          <w:sz w:val="18"/>
+        </w:rPr>
+        <w:t>[5] Passive shoulder occupational exoskeleton reduces shoulder muscle coactivation in repetitive arm movements. Scientific Reports 14 (2024). DOI 10.1038/s41598-024-78090-2</w:t>
+      </w:r>
+    </w:p>
+    <w:p>
+      <w:pPr>
+        <w:spacing w:after="60" w:line="276" w:lineRule="auto"/>
+        <w:ind w:left="454" w:hanging="454"/>
+      </w:pPr>
+      <w:r>
+        <w:rPr>
+          <w:rFonts w:ascii="Calibri" w:hAnsi="Calibri" w:eastAsia="Microsoft YaHei"/>
+          <w:b w:val="0"/>
+          <w:i w:val="0"/>
+          <w:sz w:val="18"/>
+        </w:rPr>
+        <w:t>[6] Modulation of shoulder muscle and joint function using a powered upper-limb exoskeleton (ArmeoPower). J. Biomech. (2018). PubMed 29506759.</w:t>
+      </w:r>
+    </w:p>
+    <w:p>
+      <w:pPr>
+        <w:spacing w:after="60" w:line="276" w:lineRule="auto"/>
+        <w:ind w:left="454" w:hanging="454"/>
+      </w:pPr>
+      <w:r>
+        <w:rPr>
+          <w:rFonts w:ascii="Calibri" w:hAnsi="Calibri" w:eastAsia="Microsoft YaHei"/>
+          <w:b w:val="0"/>
+          <w:i w:val="0"/>
+          <w:sz w:val="18"/>
+        </w:rPr>
+        <w:t>[7] Thelen D.G., Anderson F.C., Delp S.L. Generating dynamic simulations of movement using computed muscle control. J. Biomech. 36(3):321-328 (2003). DOI 10.1016/S0021-9290(02)00432-3</w:t>
+      </w:r>
+    </w:p>
+    <w:p>
+      <w:pPr>
+        <w:spacing w:after="60" w:line="276" w:lineRule="auto"/>
+        <w:ind w:left="454" w:hanging="454"/>
+      </w:pPr>
+      <w:r>
+        <w:rPr>
+          <w:rFonts w:ascii="Calibri" w:hAnsi="Calibri" w:eastAsia="Microsoft YaHei"/>
+          <w:b w:val="0"/>
+          <w:i w:val="0"/>
+          <w:sz w:val="18"/>
+        </w:rPr>
+        <w:t>[8] Maffiuletti N.A., et al. Rate of force development: physiological and methodological considerations. Eur. J. Appl. Physiol. 116 (2016). DOI 10.1007/s00421-016-3346-6</w:t>
+      </w:r>
+    </w:p>
+    <w:p>
+      <w:pPr>
+        <w:spacing w:after="60" w:line="276" w:lineRule="auto"/>
+        <w:ind w:left="454" w:hanging="454"/>
+      </w:pPr>
+      <w:r>
+        <w:rPr>
+          <w:rFonts w:ascii="Calibri" w:hAnsi="Calibri" w:eastAsia="Microsoft YaHei"/>
+          <w:b w:val="0"/>
+          <w:i w:val="0"/>
+          <w:sz w:val="18"/>
+        </w:rPr>
+        <w:t>[9] ASTM F3517-21. Standard Practice for Movement Tests When Using an Exoskeleton. ASTM International (2021).</w:t>
+      </w:r>
+    </w:p>
+    <w:p>
+      <w:pPr>
+        <w:spacing w:after="60" w:line="276" w:lineRule="auto"/>
+        <w:ind w:left="454" w:hanging="454"/>
+      </w:pPr>
+      <w:r>
+        <w:rPr>
+          <w:rFonts w:ascii="Calibri" w:hAnsi="Calibri" w:eastAsia="Microsoft YaHei"/>
+          <w:b w:val="0"/>
+          <w:i w:val="0"/>
+          <w:sz w:val="18"/>
+        </w:rPr>
+        <w:t>[10] MuJoCo 3.16.0, Google DeepMind. https://github.com/google-deepmind/mujoco</w:t>
+      </w:r>
+    </w:p>
+    <w:p>
+      <w:pPr>
+        <w:spacing w:after="60" w:line="276" w:lineRule="auto"/>
+        <w:ind w:left="454" w:hanging="454"/>
+      </w:pPr>
+      <w:r>
+        <w:rPr>
+          <w:rFonts w:ascii="Calibri" w:hAnsi="Calibri" w:eastAsia="Microsoft YaHei"/>
+          <w:b w:val="0"/>
+          <w:i w:val="0"/>
+          <w:sz w:val="18"/>
+        </w:rPr>
+        <w:t>[11] MyoSim 0.2.3 / MyoSuite, MyoHub. https://github.com/MyoHub/myo_sim ; https://github.com/MyoHub/myosuite</w:t>
+      </w:r>
+    </w:p>
+    <w:p>
+      <w:pPr>
+        <w:spacing w:after="60" w:line="276" w:lineRule="auto"/>
+        <w:ind w:left="454" w:hanging="454"/>
+      </w:pPr>
+      <w:r>
+        <w:rPr>
+          <w:rFonts w:ascii="Calibri" w:hAnsi="Calibri" w:eastAsia="Microsoft YaHei"/>
+          <w:b w:val="0"/>
+          <w:i w:val="0"/>
+          <w:sz w:val="18"/>
+        </w:rPr>
+        <w:t>[12] ExoKit, HCI Lab Saarland. https://github.com/HCI-Lab-Saarland/ExoKit</w:t>
+      </w:r>
+    </w:p>
+    <w:p>
+      <w:pPr>
+        <w:spacing w:after="60" w:line="276" w:lineRule="auto"/>
+        <w:ind w:left="454" w:hanging="454"/>
+      </w:pPr>
+      <w:r>
+        <w:rPr>
+          <w:rFonts w:ascii="Calibri" w:hAnsi="Calibri" w:eastAsia="Microsoft YaHei"/>
+          <w:b w:val="0"/>
+          <w:i w:val="0"/>
+          <w:sz w:val="18"/>
+        </w:rPr>
+        <w:t>[13] MyoSuite issue #337（肌肉模型的反解建议）. https://github.com/MyoHub/myosuite/issues/337</w:t>
+      </w:r>
+    </w:p>
+    <w:p>
+      <w:pPr>
+        <w:spacing w:before="280" w:after="80"/>
+      </w:pPr>
+      <w:r>
+        <w:rPr>
+          <w:rFonts w:ascii="Calibri" w:hAnsi="Calibri" w:eastAsia="Microsoft YaHei"/>
+          <w:b/>
+          <w:i w:val="0"/>
+          <w:color w:val="1F3B57"/>
+          <w:sz w:val="30"/>
+        </w:rPr>
+        <w:t>12. 本项目完成的工作</w:t>
+      </w:r>
+      <w:r>
+        <w:rPr>
+          <w:rFonts w:ascii="Calibri" w:hAnsi="Calibri" w:eastAsia="Microsoft YaHei"/>
+          <w:b w:val="0"/>
+          <w:i/>
+          <w:color w:val="555555"/>
+          <w:sz w:val="30"/>
+        </w:rPr>
+        <w:t xml:space="preserve">  /  12. Work Performed</w:t>
+      </w:r>
+    </w:p>
+    <w:p>
+      <w:pPr>
+        <w:spacing w:after="40" w:line="276" w:lineRule="auto"/>
+      </w:pPr>
+      <w:r>
+        <w:rPr>
+          <w:rFonts w:ascii="Calibri" w:hAnsi="Calibri" w:eastAsia="Microsoft YaHei"/>
+          <w:b w:val="0"/>
+          <w:i w:val="0"/>
+          <w:sz w:val="21"/>
+        </w:rPr>
+        <w:t>以下按“仿真环境、控制接入、实验、固件、文档”五块列出本次实际完成的内容，以及明确没有做的事。</w:t>
+      </w:r>
+    </w:p>
+    <w:p>
+      <w:pPr>
+        <w:spacing w:after="160" w:line="276" w:lineRule="auto"/>
+      </w:pPr>
+      <w:r>
+        <w:rPr>
+          <w:rFonts w:ascii="Calibri" w:hAnsi="Calibri" w:eastAsia="Microsoft YaHei"/>
+          <w:b w:val="0"/>
+          <w:i/>
+          <w:color w:val="555555"/>
+          <w:sz w:val="20"/>
+        </w:rPr>
+        <w:t>The list below covers what was actually delivered in five blocks (simulation environment, control integration, experiments, firmware, documentation) and what was deliberately not done.</w:t>
+      </w:r>
+    </w:p>
+    <w:tbl>
+      <w:tblPr>
+        <w:tblStyle w:val="TableGrid"/>
+        <w:tblW w:type="auto" w:w="0"/>
+        <w:jc w:val="center"/>
+        <w:tblLook w:firstColumn="1" w:firstRow="1" w:lastColumn="0" w:lastRow="0" w:noHBand="0" w:noVBand="1" w:val="04A0"/>
+      </w:tblPr>
+      <w:tblGrid>
+        <w:gridCol w:w="4873"/>
+        <w:gridCol w:w="4873"/>
+      </w:tblGrid>
+      <w:tr>
+        <w:tc>
+          <w:tcPr>
+            <w:tcW w:type="dxa" w:w="1701"/>
+          </w:tcPr>
+          <w:p>
+            <w:r/>
+            <w:r>
+              <w:rPr>
+                <w:rFonts w:ascii="Calibri" w:hAnsi="Calibri" w:eastAsia="Microsoft YaHei"/>
+                <w:b/>
+                <w:i w:val="0"/>
+                <w:sz w:val="17"/>
+              </w:rPr>
+              <w:t>类别 / Area</w:t>
+            </w:r>
+          </w:p>
+        </w:tc>
+        <w:tc>
+          <w:tcPr>
+            <w:tcW w:type="dxa" w:w="7370"/>
+          </w:tcPr>
+          <w:p>
+            <w:r/>
+            <w:r>
+              <w:rPr>
+                <w:rFonts w:ascii="Calibri" w:hAnsi="Calibri" w:eastAsia="Microsoft YaHei"/>
+                <w:b/>
+                <w:i w:val="0"/>
+                <w:sz w:val="17"/>
+              </w:rPr>
+              <w:t>完成内容 / Delivered</w:t>
+            </w:r>
+          </w:p>
+        </w:tc>
+      </w:tr>
+      <w:tr>
+        <w:tc>
+          <w:tcPr>
+            <w:tcW w:type="dxa" w:w="1701"/>
+          </w:tcPr>
+          <w:p>
+            <w:r/>
+            <w:r>
+              <w:rPr>
+                <w:rFonts w:ascii="Calibri" w:hAnsi="Calibri" w:eastAsia="Microsoft YaHei"/>
+                <w:b w:val="0"/>
+                <w:i w:val="0"/>
+                <w:sz w:val="17"/>
+              </w:rPr>
+              <w:t>仿真环境</w:t>
+            </w:r>
+          </w:p>
+        </w:tc>
+        <w:tc>
+          <w:tcPr>
+            <w:tcW w:type="dxa" w:w="7370"/>
+          </w:tcPr>
+          <w:p>
+            <w:r/>
+            <w:r>
+              <w:rPr>
+                <w:rFonts w:ascii="Calibri" w:hAnsi="Calibri" w:eastAsia="Microsoft YaHei"/>
+                <w:b w:val="0"/>
+                <w:i w:val="0"/>
+                <w:sz w:val="17"/>
+              </w:rPr>
+              <w:t>MuJoCo 场景：MyoArm 人体 + CAD 外骨骼 + 0.90 m 桌子与竖杆 + 两条软绑带；肩/肘轴对齐、调节轨加长、竖杆穿过夹持座孔；参数集中在 params.json 并标注来源</w:t>
+            </w:r>
+          </w:p>
+        </w:tc>
+      </w:tr>
+      <w:tr>
+        <w:tc>
+          <w:tcPr>
+            <w:tcW w:type="dxa" w:w="1701"/>
+          </w:tcPr>
+          <w:p>
+            <w:r/>
+            <w:r>
+              <w:rPr>
+                <w:rFonts w:ascii="Calibri" w:hAnsi="Calibri" w:eastAsia="Microsoft YaHei"/>
+                <w:b w:val="0"/>
+                <w:i w:val="0"/>
+                <w:sz w:val="17"/>
+              </w:rPr>
+              <w:t>控制接入</w:t>
+            </w:r>
+          </w:p>
+        </w:tc>
+        <w:tc>
+          <w:tcPr>
+            <w:tcW w:type="dxa" w:w="7370"/>
+          </w:tcPr>
+          <w:p>
+            <w:r/>
+            <w:r>
+              <w:rPr>
+                <w:rFonts w:ascii="Calibri" w:hAnsi="Calibri" w:eastAsia="Microsoft YaHei"/>
+                <w:b w:val="0"/>
+                <w:i w:val="0"/>
+                <w:sz w:val="17"/>
+              </w:rPr>
+              <w:t>把固件 App/control 与 s5_site.c 编译成主机库，仿真按 10 ms 调用；抽出 s5_assist_compose 供固件与仿真共用；新增 125 项主机测试</w:t>
+            </w:r>
+          </w:p>
+        </w:tc>
+      </w:tr>
+      <w:tr>
+        <w:tc>
+          <w:tcPr>
+            <w:tcW w:type="dxa" w:w="1701"/>
+          </w:tcPr>
+          <w:p>
+            <w:r/>
+            <w:r>
+              <w:rPr>
+                <w:rFonts w:ascii="Calibri" w:hAnsi="Calibri" w:eastAsia="Microsoft YaHei"/>
+                <w:b w:val="0"/>
+                <w:i w:val="0"/>
+                <w:sz w:val="17"/>
+              </w:rPr>
+              <w:t>人体模型</w:t>
+            </w:r>
+          </w:p>
+        </w:tc>
+        <w:tc>
+          <w:tcPr>
+            <w:tcW w:type="dxa" w:w="7370"/>
+          </w:tcPr>
+          <w:p>
+            <w:r/>
+            <w:r>
+              <w:rPr>
+                <w:rFonts w:ascii="Calibri" w:hAnsi="Calibri" w:eastAsia="Microsoft YaHei"/>
+                <w:b w:val="0"/>
+                <w:i w:val="0"/>
+                <w:sz w:val="17"/>
+              </w:rPr>
+              <w:t>理想关节力矩版；肌肉驱动版（计算力矩前馈 + 静态优化 + 63 块肌肉，含激活动力学）</w:t>
+            </w:r>
+          </w:p>
+        </w:tc>
+      </w:tr>
+      <w:tr>
+        <w:tc>
+          <w:tcPr>
+            <w:tcW w:type="dxa" w:w="1701"/>
+          </w:tcPr>
+          <w:p>
+            <w:r/>
+            <w:r>
+              <w:rPr>
+                <w:rFonts w:ascii="Calibri" w:hAnsi="Calibri" w:eastAsia="Microsoft YaHei"/>
+                <w:b w:val="0"/>
+                <w:i w:val="0"/>
+                <w:sz w:val="17"/>
+              </w:rPr>
+              <w:t>实验</w:t>
+            </w:r>
+          </w:p>
+        </w:tc>
+        <w:tc>
+          <w:tcPr>
+            <w:tcW w:type="dxa" w:w="7370"/>
+          </w:tcPr>
+          <w:p>
+            <w:r/>
+            <w:r>
+              <w:rPr>
+                <w:rFonts w:ascii="Calibri" w:hAnsi="Calibri" w:eastAsia="Microsoft YaHei"/>
+                <w:b w:val="0"/>
+                <w:i w:val="0"/>
+                <w:sz w:val="17"/>
+              </w:rPr>
+              <w:t>工作空间扫描（12×9）；三个手术姿势各 60 s；锤击与快速抬举两个爆发动作；T1–T3 理想力矩对照；每种条件 C0/C1/C2</w:t>
+            </w:r>
+          </w:p>
+        </w:tc>
+      </w:tr>
+      <w:tr>
+        <w:tc>
+          <w:tcPr>
+            <w:tcW w:type="dxa" w:w="1701"/>
+          </w:tcPr>
+          <w:p>
+            <w:r/>
+            <w:r>
+              <w:rPr>
+                <w:rFonts w:ascii="Calibri" w:hAnsi="Calibri" w:eastAsia="Microsoft YaHei"/>
+                <w:b w:val="0"/>
+                <w:i w:val="0"/>
+                <w:sz w:val="17"/>
+              </w:rPr>
+              <w:t>主要结果</w:t>
+            </w:r>
+          </w:p>
+        </w:tc>
+        <w:tc>
+          <w:tcPr>
+            <w:tcW w:type="dxa" w:w="7370"/>
+          </w:tcPr>
+          <w:p>
+            <w:r/>
+            <w:r>
+              <w:rPr>
+                <w:rFonts w:ascii="Calibri" w:hAnsi="Calibri" w:eastAsia="Microsoft YaHei"/>
+                <w:b w:val="0"/>
+                <w:i w:val="0"/>
+                <w:sz w:val="17"/>
+              </w:rPr>
+              <w:t>前三角肌相对穿戴降低 11.7–20.3%；相对裸臂约 3%；爆发 6.4%（肘）/0.7%（肩）；查明放下阶段 +10.5% 的根因；给出惯性/重力分解（250 ms 时重力仅占 8.6%）</w:t>
+            </w:r>
+          </w:p>
+        </w:tc>
+      </w:tr>
+      <w:tr>
+        <w:tc>
+          <w:tcPr>
+            <w:tcW w:type="dxa" w:w="1701"/>
+          </w:tcPr>
+          <w:p>
+            <w:r/>
+            <w:r>
+              <w:rPr>
+                <w:rFonts w:ascii="Calibri" w:hAnsi="Calibri" w:eastAsia="Microsoft YaHei"/>
+                <w:b w:val="0"/>
+                <w:i w:val="0"/>
+                <w:sz w:val="17"/>
+              </w:rPr>
+              <w:t>固件改动</w:t>
+            </w:r>
+          </w:p>
+        </w:tc>
+        <w:tc>
+          <w:tcPr>
+            <w:tcW w:type="dxa" w:w="7370"/>
+          </w:tcPr>
+          <w:p>
+            <w:r/>
+            <w:r>
+              <w:rPr>
+                <w:rFonts w:ascii="Calibri" w:hAnsi="Calibri" w:eastAsia="Microsoft YaHei"/>
+                <w:b w:val="0"/>
+                <w:i w:val="0"/>
+                <w:sz w:val="17"/>
+              </w:rPr>
+              <w:t>肘幅值 2 A→10 A；肩增益 1.5、上限 300 mNm（新编译选项）；肘通道新增 Amplify；Amplify 改瞬时切换；输出周期 50→10 ms；正功率门控（默认关）。镜像已编译（142392 B，0 警告），**未刷写**</w:t>
+            </w:r>
+          </w:p>
+        </w:tc>
+      </w:tr>
+      <w:tr>
+        <w:tc>
+          <w:tcPr>
+            <w:tcW w:type="dxa" w:w="1701"/>
+          </w:tcPr>
+          <w:p>
+            <w:r/>
+            <w:r>
+              <w:rPr>
+                <w:rFonts w:ascii="Calibri" w:hAnsi="Calibri" w:eastAsia="Microsoft YaHei"/>
+                <w:b w:val="0"/>
+                <w:i w:val="0"/>
+                <w:sz w:val="17"/>
+              </w:rPr>
+              <w:t>工具与文档</w:t>
+            </w:r>
+          </w:p>
+        </w:tc>
+        <w:tc>
+          <w:tcPr>
+            <w:tcW w:type="dxa" w:w="7370"/>
+          </w:tcPr>
+          <w:p>
+            <w:r/>
+            <w:r>
+              <w:rPr>
+                <w:rFonts w:ascii="Calibri" w:hAnsi="Calibri" w:eastAsia="Microsoft YaHei"/>
+                <w:b w:val="0"/>
+                <w:i w:val="0"/>
+                <w:sz w:val="17"/>
+              </w:rPr>
+              <w:t>15 个脚本（模型、检查、实验、报告、扫描）；一键出图；Markdown 与中英对照 Word 报告；schedule 1.2–1.4 节与逐日开发日志</w:t>
+            </w:r>
+          </w:p>
+        </w:tc>
+      </w:tr>
+      <w:tr>
+        <w:tc>
+          <w:tcPr>
+            <w:tcW w:type="dxa" w:w="1701"/>
+          </w:tcPr>
+          <w:p>
+            <w:r/>
+            <w:r>
+              <w:rPr>
+                <w:rFonts w:ascii="Calibri" w:hAnsi="Calibri" w:eastAsia="Microsoft YaHei"/>
+                <w:b w:val="0"/>
+                <w:i w:val="0"/>
+                <w:sz w:val="17"/>
+              </w:rPr>
+              <w:t>未做 / Not done</w:t>
+            </w:r>
+          </w:p>
+        </w:tc>
+        <w:tc>
+          <w:tcPr>
+            <w:tcW w:type="dxa" w:w="7370"/>
+          </w:tcPr>
+          <w:p>
+            <w:r/>
+            <w:r>
+              <w:rPr>
+                <w:rFonts w:ascii="Calibri" w:hAnsi="Calibri" w:eastAsia="Microsoft YaHei"/>
+                <w:b w:val="0"/>
+                <w:i w:val="0"/>
+                <w:sz w:val="17"/>
+              </w:rPr>
+              <w:t>台架对标（M5 取消）；镜像刷写与实机验证；方向相关重力基线；跨受试者变异性；肩外展/旋转自由度</w:t>
+            </w:r>
+          </w:p>
+        </w:tc>
+      </w:tr>
+    </w:tbl>
+    <w:p>
+      <w:pPr>
+        <w:spacing w:after="40"/>
+      </w:pPr>
+    </w:p>
     <w:sectPr>
       <w:footerReference w:type="default" r:id="rId9"/>
       <w:pgSz w:w="12240" w:h="15840"/>

</xml_diff>

<commit_message>
docs(sim): align the workspace text with the current-default rerun
The heat map had already been regenerated with shoulder gain 1.5 / 300 mNm,
but the Markdown report, the Word caption and the README still quoted the
gain 1.0 / 205 mNm numbers (+9.4 % mean benefit, over-help at shoulder 5-20 /
elbow 30-60). Quote workspace-final instead (+13.7 % mean, 19-24 % at
shoulder 60, negative activation benefit at shoulder 10-15), keep the old
column in the README for comparison, and bring the schedule status lines and
log up to date.

Generated with [Devin](https://devin.ai)

Co-Authored-By: Devin <158243242+devin-ai-integration[bot]@users.noreply.github.com>
</commit_message>
<xml_diff>
--- a/firmware/Exoskeleton_F446/sim/mujoco_arm/docs/validation_report_bilingual.docx
+++ b/firmware/Exoskeleton_F446/sim/mujoco_arm/docs/validation_report_bilingual.docx
@@ -2556,7 +2556,7 @@
           <w:i w:val="0"/>
           <w:sz w:val="20"/>
         </w:rPr>
-        <w:t>看什么：左图是“穿上不通电比裸臂多费多少力”，中间是“助力能收回多少”，右边是激活量的收益。抬臂越高、肘越弯，助力越有效（肩 60°/肘 70–110° 处 12–16%）；而低抬臂（肩 5–20°）+ 小屈肘（30–60°）区域是红色——助力反而让肌肉更累，说明该姿态下自重补偿“帮过头”，需要在台架小角度复核。</w:t>
+        <w:t>看什么：左图是“穿上不通电比裸臂多费多少力”，中间是“助力能收回多少”，右边是激活量的收益。当前默认参数下穿戴代价均值 +13.2%、助力收益均值 +13.7%、激活收益均值 +6.9%。抬臂越高、肘越弯，助力越有效（肩 60°/肘 70–110° 处 19–24%）；低抬臂（肩 10–15°）区域激活收益为负（多为 −3…−5%，个别 −14%）——助力反而让肌肉更累，说明该姿态下补偿“帮过头”，需要在台架小角度复核。激活基线 &lt;0.2 的格子标 n/a，因为基线太小时百分比会被放大成假象。</w:t>
       </w:r>
     </w:p>
     <w:p>
@@ -2571,7 +2571,7 @@
           <w:color w:val="555555"/>
           <w:sz w:val="19"/>
         </w:rPr>
-        <w:t>What to look at: The left panel is how much more effort the unpowered device costs, the middle how much the assist gives back, the right the activation benefit. Assistance works better the higher and more flexed the arm is (12–16% at 60° shoulder, 70–110° elbow), while the low-elevation, small-elbow region is red: there the assist raises activation, i.e. it over-compensates, and that region should be checked on the bench.</w:t>
+        <w:t>What to look at: The left panel is how much more effort the unpowered device costs, the middle how much the assist gives back, the right the activation benefit. With the current defaults the means are +13.2% cost, +13.7% benefit and +6.9% activation benefit. Assistance works better the higher and more flexed the arm is (19–24% at 60° shoulder, 70–110° elbow), while at low elevation (10–15° shoulder) the activation benefit is negative (mostly −3 to −5%, one cell −14%): there the assist over-compensates, and that region should be checked on the bench. Cells with an unpowered activation below 0.2 are marked n/a, because a percentage of such a small baseline is misleading.</w:t>
       </w:r>
     </w:p>
     <w:p>

</xml_diff>

<commit_message>
chore(sim): drop one-off scripts and the ideal-torque M4 chain
The report and every current number come from the muscle-driven runs
(report_muscle_all.py) and the workspace scan, so the one-off diagnostics
(smoke_env, lift_contact, check_timing with the unused io_model/timing.json,
sweep_elbow_ma, burst_report, activation_report), the ideal-torque M4 runner
(run_experiment, runner, tasks, metrics, plots, report_figures) and the
fixed-number checks in test_bridge/check_static are no longer needed.
burst.py keeps only the motion definitions the muscle drive uses. README gets
a current command table; requirements now pin python-docx and lxml.

A full rerun after the cleanup reproduces the report: figures 01-05 are
byte-identical, the static, deltoid, burst and workspace numbers unchanged.

Generated with [Devin](https://devin.ai)

Co-Authored-By: Devin <158243242+devin-ai-integration[bot]@users.noreply.github.com>
</commit_message>
<xml_diff>
--- a/firmware/Exoskeleton_F446/sim/mujoco_arm/docs/validation_report_bilingual.docx
+++ b/firmware/Exoskeleton_F446/sim/mujoco_arm/docs/validation_report_bilingual.docx
@@ -1943,7 +1943,7 @@
                 <w:i w:val="0"/>
                 <w:sz w:val="18"/>
               </w:rPr>
-              <w:t>理想力矩模型对照</w:t>
+              <w:t>理想力矩模型对照（早期，脚本已清理）</w:t>
             </w:r>
           </w:p>
         </w:tc>
@@ -5753,7 +5753,7 @@
                 <w:i w:val="0"/>
                 <w:sz w:val="17"/>
               </w:rPr>
-              <w:t>工作空间扫描（12×9）；三个手术姿势各 60 s；锤击与快速抬举两个爆发动作；T1–T3 理想力矩对照；每种条件 C0/C1/C2</w:t>
+              <w:t>工作空间扫描（12×9）；三个手术姿势各 60 s；锤击与快速抬举两个爆发动作；T1–T3 理想力矩对照（早期，脚本已清理）；每种条件 C0/C1/C2</w:t>
             </w:r>
           </w:p>
         </w:tc>
@@ -5861,7 +5861,7 @@
                 <w:i w:val="0"/>
                 <w:sz w:val="17"/>
               </w:rPr>
-              <w:t>15 个脚本（模型、检查、实验、报告、扫描）；一键出图；Markdown 与中英对照 Word 报告；schedule 1.2–1.4 节与逐日开发日志</w:t>
+              <w:t>8 个脚本（模型、检查、实验、报告、扫描）；一键出图；Markdown 与中英对照 Word 报告；schedule 1.2–1.4 节与逐日开发日志</w:t>
             </w:r>
           </w:p>
         </w:tc>

</xml_diff>